<commit_message>
Replace portfolio resume with latest downloaded update.
</commit_message>
<xml_diff>
--- a/public/Mar_Thayne_Nacionales_Master_Resume_Clean.docx
+++ b/public/Mar_Thayne_Nacionales_Master_Resume_Clean.docx
@@ -4,692 +4,1035 @@
   <w:body>
     <w:p>
       <w:pPr>
-        <w:spacing w:after="6"/>
+        <w:spacing w:after="40"/>
         <w:jc w:val="center"/>
       </w:pPr>
       <w:r>
         <w:rPr>
-          <w:rFonts w:ascii="Arial" w:hAnsi="Arial" w:eastAsia="Arial"/>
+          <w:rFonts w:ascii="Times New Roman" w:hAnsi="Times New Roman" w:eastAsia="Times New Roman"/>
           <w:b/>
-          <w:color w:val="1C1C1C"/>
-          <w:sz w:val="36"/>
+          <w:sz w:val="34"/>
         </w:rPr>
-        <w:t>MAR THAYNE LOWELL NACIONALES</w:t>
+        <w:t>Mar Thayne Lowell Nacionales</w:t>
       </w:r>
     </w:p>
     <w:p>
       <w:pPr>
-        <w:spacing w:after="52"/>
+        <w:spacing w:after="120"/>
         <w:jc w:val="center"/>
       </w:pPr>
       <w:r>
         <w:rPr>
-          <w:rFonts w:ascii="Arial" w:hAnsi="Arial" w:eastAsia="Arial"/>
-          <w:b/>
-          <w:color w:val="124F65"/>
-          <w:sz w:val="20"/>
+          <w:rFonts w:ascii="Times New Roman" w:hAnsi="Times New Roman" w:eastAsia="Times New Roman"/>
+          <w:sz w:val="21"/>
         </w:rPr>
-        <w:t>MARKETING AUTOMATION • DIGITAL MARKETING • WEB DEVELOPMENT</w:t>
-      </w:r>
-    </w:p>
-    <w:p>
-      <w:pPr>
-        <w:spacing w:after="88"/>
-        <w:jc w:val="center"/>
-        <w:pBdr>
-          <w:bottom w:val="single" w:sz="7" w:space="2" w:color="6F8C98"/>
-        </w:pBdr>
-      </w:pPr>
-      <w:r>
-        <w:rPr>
-          <w:rFonts w:ascii="Arial" w:hAnsi="Arial" w:eastAsia="Arial"/>
-          <w:color w:val="4E4E4E"/>
-          <w:sz w:val="17"/>
-        </w:rPr>
-        <w:t xml:space="preserve">Pasig City / Quezon City, Philippines  |  +63 919 373 2269  |  </w:t>
+        <w:t xml:space="preserve">Pasig City, Philippines | </w:t>
       </w:r>
       <w:hyperlink r:id="rId9">
         <w:r>
           <w:rPr>
-            <w:rFonts w:ascii="Arial" w:hAnsi="Arial"/>
-            <w:color w:val="124F65"/>
-            <w:sz w:val="18"/>
+            <w:rFonts w:ascii="Times New Roman" w:hAnsi="Times New Roman"/>
+            <w:color w:val="0000FF"/>
+            <w:u w:val="single"/>
+            <w:sz w:val="21"/>
           </w:rPr>
-          <w:t>marthnacionales@gmail.com</w:t>
+          <w:t>LinkedIn</w:t>
         </w:r>
       </w:hyperlink>
       <w:r>
         <w:rPr>
-          <w:rFonts w:ascii="Arial" w:hAnsi="Arial" w:eastAsia="Arial"/>
-          <w:color w:val="4E4E4E"/>
-          <w:sz w:val="17"/>
+          <w:rFonts w:ascii="Times New Roman" w:hAnsi="Times New Roman" w:eastAsia="Times New Roman"/>
+          <w:sz w:val="21"/>
         </w:rPr>
-        <w:t xml:space="preserve">  |  </w:t>
+        <w:t xml:space="preserve"> | +63 919 373 2269 | </w:t>
       </w:r>
       <w:hyperlink r:id="rId10">
         <w:r>
           <w:rPr>
-            <w:rFonts w:ascii="Arial" w:hAnsi="Arial"/>
-            <w:color w:val="124F65"/>
-            <w:sz w:val="18"/>
+            <w:rFonts w:ascii="Times New Roman" w:hAnsi="Times New Roman"/>
+            <w:color w:val="0000FF"/>
+            <w:u w:val="single"/>
+            <w:sz w:val="21"/>
           </w:rPr>
-          <w:t>github.com/thayl0w</w:t>
+          <w:t>marthnacionales@gmail.com</w:t>
         </w:r>
       </w:hyperlink>
     </w:p>
     <w:p>
       <w:pPr>
-        <w:spacing w:before="110" w:after="50"/>
+        <w:spacing w:before="180" w:after="160"/>
         <w:pBdr>
-          <w:bottom w:val="single" w:sz="5" w:space="2" w:color="9CB0B8"/>
+          <w:bottom w:val="single" w:sz="8" w:space="5" w:color="000000"/>
         </w:pBdr>
       </w:pPr>
       <w:r>
         <w:rPr>
-          <w:rFonts w:ascii="Arial" w:hAnsi="Arial" w:eastAsia="Arial"/>
+          <w:rFonts w:ascii="Times New Roman" w:hAnsi="Times New Roman" w:eastAsia="Times New Roman"/>
           <w:b/>
-          <w:color w:val="124F65"/>
-          <w:sz w:val="20"/>
+          <w:sz w:val="22"/>
         </w:rPr>
-        <w:t>PROFESSIONAL EXPERIENCE</w:t>
+        <w:t>TECHNICAL SKILLS</w:t>
+      </w:r>
+    </w:p>
+    <w:p>
+      <w:pPr>
+        <w:spacing w:after="40"/>
+      </w:pPr>
+      <w:r>
+        <w:rPr>
+          <w:rFonts w:ascii="Times New Roman" w:hAnsi="Times New Roman" w:eastAsia="Times New Roman"/>
+          <w:b/>
+          <w:sz w:val="21"/>
+        </w:rPr>
+        <w:t xml:space="preserve">Web Development &amp; Programming: </w:t>
+      </w:r>
+      <w:r>
+        <w:rPr>
+          <w:rFonts w:ascii="Times New Roman" w:hAnsi="Times New Roman" w:eastAsia="Times New Roman"/>
+          <w:sz w:val="21"/>
+        </w:rPr>
+        <w:t>HTML5 • CSS3 / Tailwind CSS • JavaScript (ES6+) • Python • Astro.js • Git &amp; GitHub • Responsive Design • Vercel Deployment • Mysql, Postgresql, node.js</w:t>
+      </w:r>
+    </w:p>
+    <w:p>
+      <w:pPr>
+        <w:spacing w:after="40"/>
+      </w:pPr>
+      <w:r>
+        <w:rPr>
+          <w:rFonts w:ascii="Times New Roman" w:hAnsi="Times New Roman" w:eastAsia="Times New Roman"/>
+          <w:b/>
+          <w:sz w:val="21"/>
+        </w:rPr>
+        <w:t xml:space="preserve">Digital Marketing &amp; Automation: </w:t>
+      </w:r>
+      <w:r>
+        <w:rPr>
+          <w:rFonts w:ascii="Times New Roman" w:hAnsi="Times New Roman" w:eastAsia="Times New Roman"/>
+          <w:sz w:val="21"/>
+        </w:rPr>
+        <w:t>Meta Ads Manager • GoHighLevel • Systeme.io • ClickFunnels • Email/SMS Automation • SEO • Social Media Content Strategy, carousels, content graphic and ad creation, • Lead Magnet Creation • A/B Testing &amp; Analytics • CRM Pipeline Management, Gorgias, WordPress, Canva,</w:t>
+      </w:r>
+    </w:p>
+    <w:p>
+      <w:pPr>
+        <w:spacing w:after="40"/>
+      </w:pPr>
+      <w:r>
+        <w:rPr>
+          <w:rFonts w:ascii="Times New Roman" w:hAnsi="Times New Roman" w:eastAsia="Times New Roman"/>
+          <w:b/>
+          <w:sz w:val="21"/>
+        </w:rPr>
+        <w:t xml:space="preserve">Productivity &amp; Tools: </w:t>
+      </w:r>
+      <w:r>
+        <w:rPr>
+          <w:rFonts w:ascii="Times New Roman" w:hAnsi="Times New Roman" w:eastAsia="Times New Roman"/>
+          <w:sz w:val="21"/>
+        </w:rPr>
+        <w:t>Microsoft Office (Word, Excel, PowerPoint) • Google Workspace • Trello • Data Entry &amp; Record Management • Technical Documentation • Before/After Graphics • PowerShell Scripting, jotform, googleform</w:t>
+      </w:r>
+    </w:p>
+    <w:p>
+      <w:pPr>
+        <w:spacing w:before="180" w:after="160"/>
+        <w:pBdr>
+          <w:bottom w:val="single" w:sz="8" w:space="5" w:color="000000"/>
+        </w:pBdr>
+      </w:pPr>
+      <w:r>
+        <w:rPr>
+          <w:rFonts w:ascii="Times New Roman" w:hAnsi="Times New Roman" w:eastAsia="Times New Roman"/>
+          <w:b/>
+          <w:sz w:val="22"/>
+        </w:rPr>
+        <w:t>EXPERIENCE</w:t>
+      </w:r>
+    </w:p>
+    <w:p>
+      <w:pPr>
+        <w:keepNext/>
+        <w:spacing w:before="100" w:after="0"/>
+      </w:pPr>
+      <w:r>
+        <w:rPr>
+          <w:rFonts w:ascii="Times New Roman" w:hAnsi="Times New Roman" w:eastAsia="Times New Roman"/>
+          <w:b/>
+          <w:sz w:val="21"/>
+        </w:rPr>
+        <w:t>Independent Contractor — Software Development &amp; Digital Marketing</w:t>
+      </w:r>
+    </w:p>
+    <w:p>
+      <w:pPr>
+        <w:spacing w:after="30"/>
+      </w:pPr>
+      <w:r>
+        <w:rPr>
+          <w:rFonts w:ascii="Times New Roman" w:hAnsi="Times New Roman" w:eastAsia="Times New Roman"/>
+          <w:i/>
+          <w:sz w:val="21"/>
+        </w:rPr>
+        <w:t>Self-Employed | Remote / Philippines | 2023 – Present</w:t>
+      </w:r>
+    </w:p>
+    <w:p>
+      <w:pPr>
+        <w:keepLines/>
+        <w:spacing w:after="24"/>
+        <w:ind w:left="317" w:hanging="245"/>
+      </w:pPr>
+      <w:r>
+        <w:rPr>
+          <w:rFonts w:ascii="Times New Roman" w:hAnsi="Times New Roman" w:eastAsia="Times New Roman"/>
+          <w:sz w:val="21"/>
+        </w:rPr>
+        <w:t>•</w:t>
+      </w:r>
+      <w:r>
+        <w:rPr>
+          <w:rFonts w:ascii="Times New Roman" w:hAnsi="Times New Roman" w:eastAsia="Times New Roman"/>
+          <w:sz w:val="21"/>
+        </w:rPr>
+        <w:t xml:space="preserve">  Design and deploy custom websites, landing pages, and sales funnels for wellness clients using HTML/CSS/JS, WordPress, Astro.js, and Tailwind CSS, improving lead capture and user experience.</w:t>
+      </w:r>
+    </w:p>
+    <w:p>
+      <w:pPr>
+        <w:keepLines/>
+        <w:spacing w:after="24"/>
+        <w:ind w:left="317" w:hanging="245"/>
+      </w:pPr>
+      <w:r>
+        <w:rPr>
+          <w:rFonts w:ascii="Times New Roman" w:hAnsi="Times New Roman" w:eastAsia="Times New Roman"/>
+          <w:sz w:val="21"/>
+        </w:rPr>
+        <w:t>•</w:t>
+      </w:r>
+      <w:r>
+        <w:rPr>
+          <w:rFonts w:ascii="Times New Roman" w:hAnsi="Times New Roman" w:eastAsia="Times New Roman"/>
+          <w:sz w:val="21"/>
+        </w:rPr>
+        <w:t xml:space="preserve">  Plan and optimize Meta advertising campaigns (creative, targeting, budget, reporting) to generate qualified leads for weight loss, diabetes, and neuropathy programs.</w:t>
+      </w:r>
+    </w:p>
+    <w:p>
+      <w:pPr>
+        <w:keepLines/>
+        <w:spacing w:after="24"/>
+        <w:ind w:left="317" w:hanging="245"/>
+      </w:pPr>
+      <w:r>
+        <w:rPr>
+          <w:rFonts w:ascii="Times New Roman" w:hAnsi="Times New Roman" w:eastAsia="Times New Roman"/>
+          <w:sz w:val="21"/>
+        </w:rPr>
+        <w:t>•</w:t>
+      </w:r>
+      <w:r>
+        <w:rPr>
+          <w:rFonts w:ascii="Times New Roman" w:hAnsi="Times New Roman" w:eastAsia="Times New Roman"/>
+          <w:sz w:val="21"/>
+        </w:rPr>
+        <w:t xml:space="preserve">  Build and manage full marketing automation in GoHighLevel/Systeme.io including forms, email/SMS sequences, and pipeline tracking to boost conversions and client value.</w:t>
+      </w:r>
+    </w:p>
+    <w:p>
+      <w:pPr>
+        <w:keepLines/>
+        <w:spacing w:after="24"/>
+        <w:ind w:left="317" w:hanging="245"/>
+      </w:pPr>
+      <w:r>
+        <w:rPr>
+          <w:rFonts w:ascii="Times New Roman" w:hAnsi="Times New Roman" w:eastAsia="Times New Roman"/>
+          <w:sz w:val="21"/>
+        </w:rPr>
+        <w:t>•</w:t>
+      </w:r>
+      <w:r>
+        <w:rPr>
+          <w:rFonts w:ascii="Times New Roman" w:hAnsi="Times New Roman" w:eastAsia="Times New Roman"/>
+          <w:sz w:val="21"/>
+        </w:rPr>
+        <w:t xml:space="preserve">  Create lead magnets (e.g. insulin resistance PDFs), testimonial graphics, and before/after visuals; handle SEO, Google reviews, and social content to strengthen client online presence and ROI.</w:t>
+      </w:r>
+    </w:p>
+    <w:p>
+      <w:pPr>
+        <w:keepNext/>
+        <w:spacing w:before="100" w:after="0"/>
+      </w:pPr>
+      <w:r>
+        <w:rPr>
+          <w:rFonts w:ascii="Times New Roman" w:hAnsi="Times New Roman" w:eastAsia="Times New Roman"/>
+          <w:b/>
+          <w:sz w:val="21"/>
+        </w:rPr>
+        <w:t>Digital Marketing Virtual Assistant</w:t>
+      </w:r>
+    </w:p>
+    <w:p>
+      <w:pPr>
+        <w:spacing w:after="30"/>
+      </w:pPr>
+      <w:r>
+        <w:rPr>
+          <w:rFonts w:ascii="Times New Roman" w:hAnsi="Times New Roman" w:eastAsia="Times New Roman"/>
+          <w:i/>
+          <w:sz w:val="21"/>
+        </w:rPr>
+        <w:t>Doneverse | Australia (Remote) | February 2024 – February 2025</w:t>
+      </w:r>
+    </w:p>
+    <w:p>
+      <w:pPr>
+        <w:keepLines/>
+        <w:spacing w:after="24"/>
+        <w:ind w:left="317" w:hanging="245"/>
+      </w:pPr>
+      <w:r>
+        <w:rPr>
+          <w:rFonts w:ascii="Times New Roman" w:hAnsi="Times New Roman" w:eastAsia="Times New Roman"/>
+          <w:sz w:val="21"/>
+        </w:rPr>
+        <w:t>•</w:t>
+      </w:r>
+      <w:r>
+        <w:rPr>
+          <w:rFonts w:ascii="Times New Roman" w:hAnsi="Times New Roman" w:eastAsia="Times New Roman"/>
+          <w:sz w:val="21"/>
+        </w:rPr>
+        <w:t xml:space="preserve">  Managed end-to-end digital marketing operations, supporting lead generation, customer acquisition, and business growth.</w:t>
+      </w:r>
+    </w:p>
+    <w:p>
+      <w:pPr>
+        <w:keepLines/>
+        <w:spacing w:after="24"/>
+        <w:ind w:left="317" w:hanging="245"/>
+      </w:pPr>
+      <w:r>
+        <w:rPr>
+          <w:rFonts w:ascii="Times New Roman" w:hAnsi="Times New Roman" w:eastAsia="Times New Roman"/>
+          <w:sz w:val="21"/>
+        </w:rPr>
+        <w:t>•</w:t>
+      </w:r>
+      <w:r>
+        <w:rPr>
+          <w:rFonts w:ascii="Times New Roman" w:hAnsi="Times New Roman" w:eastAsia="Times New Roman"/>
+          <w:sz w:val="21"/>
+        </w:rPr>
+        <w:t xml:space="preserve">  Built and optimized websites, landing pages, and sales funnels using WordPress, GoHighLevel, Systeme.io, and ClickFunnels, including custom HTML, CSS, and JavaScript.</w:t>
+      </w:r>
+    </w:p>
+    <w:p>
+      <w:pPr>
+        <w:keepLines/>
+        <w:spacing w:after="24"/>
+        <w:ind w:left="317" w:hanging="245"/>
+      </w:pPr>
+      <w:r>
+        <w:rPr>
+          <w:rFonts w:ascii="Times New Roman" w:hAnsi="Times New Roman" w:eastAsia="Times New Roman"/>
+          <w:sz w:val="21"/>
+        </w:rPr>
+        <w:t>•</w:t>
+      </w:r>
+      <w:r>
+        <w:rPr>
+          <w:rFonts w:ascii="Times New Roman" w:hAnsi="Times New Roman" w:eastAsia="Times New Roman"/>
+          <w:sz w:val="21"/>
+        </w:rPr>
+        <w:t xml:space="preserve">  Managed Meta (Facebook and Instagram) advertising campaigns, including audience targeting, creative testing, budget management, and performance optimization.</w:t>
+      </w:r>
+    </w:p>
+    <w:p>
+      <w:pPr>
+        <w:keepLines/>
+        <w:spacing w:after="24"/>
+        <w:ind w:left="317" w:hanging="245"/>
+      </w:pPr>
+      <w:r>
+        <w:rPr>
+          <w:rFonts w:ascii="Times New Roman" w:hAnsi="Times New Roman" w:eastAsia="Times New Roman"/>
+          <w:sz w:val="21"/>
+        </w:rPr>
+        <w:t>•</w:t>
+      </w:r>
+      <w:r>
+        <w:rPr>
+          <w:rFonts w:ascii="Times New Roman" w:hAnsi="Times New Roman" w:eastAsia="Times New Roman"/>
+          <w:sz w:val="21"/>
+        </w:rPr>
+        <w:t xml:space="preserve">  Developed email marketing campaigns, automation workflows, CRM pipelines, and lead nurturing systems to improve conversions.</w:t>
+      </w:r>
+    </w:p>
+    <w:p>
+      <w:pPr>
+        <w:keepLines/>
+        <w:spacing w:after="24"/>
+        <w:ind w:left="317" w:hanging="245"/>
+      </w:pPr>
+      <w:r>
+        <w:rPr>
+          <w:rFonts w:ascii="Times New Roman" w:hAnsi="Times New Roman" w:eastAsia="Times New Roman"/>
+          <w:sz w:val="21"/>
+        </w:rPr>
+        <w:t>•</w:t>
+      </w:r>
+      <w:r>
+        <w:rPr>
+          <w:rFonts w:ascii="Times New Roman" w:hAnsi="Times New Roman" w:eastAsia="Times New Roman"/>
+          <w:sz w:val="21"/>
+        </w:rPr>
+        <w:t xml:space="preserve">  Created marketing assets including social media content, graphics, ad creatives, lead magnets, and landing page copy.</w:t>
+      </w:r>
+    </w:p>
+    <w:p>
+      <w:pPr>
+        <w:keepLines/>
+        <w:spacing w:after="24"/>
+        <w:ind w:left="317" w:hanging="245"/>
+      </w:pPr>
+      <w:r>
+        <w:rPr>
+          <w:rFonts w:ascii="Times New Roman" w:hAnsi="Times New Roman" w:eastAsia="Times New Roman"/>
+          <w:sz w:val="21"/>
+        </w:rPr>
+        <w:t>•</w:t>
+      </w:r>
+      <w:r>
+        <w:rPr>
+          <w:rFonts w:ascii="Times New Roman" w:hAnsi="Times New Roman" w:eastAsia="Times New Roman"/>
+          <w:sz w:val="21"/>
+        </w:rPr>
+        <w:t xml:space="preserve">  Conducted SEO research, competitor analysis, market research, and website optimization to improve online visibility.</w:t>
+      </w:r>
+    </w:p>
+    <w:p>
+      <w:pPr>
+        <w:keepLines/>
+        <w:spacing w:after="24"/>
+        <w:ind w:left="317" w:hanging="245"/>
+      </w:pPr>
+      <w:r>
+        <w:rPr>
+          <w:rFonts w:ascii="Times New Roman" w:hAnsi="Times New Roman" w:eastAsia="Times New Roman"/>
+          <w:sz w:val="21"/>
+        </w:rPr>
+        <w:t>•</w:t>
+      </w:r>
+      <w:r>
+        <w:rPr>
+          <w:rFonts w:ascii="Times New Roman" w:hAnsi="Times New Roman" w:eastAsia="Times New Roman"/>
+          <w:sz w:val="21"/>
+        </w:rPr>
+        <w:t xml:space="preserve">  Tracked campaign performance, analyzed marketing data, and prepared reports to support data-driven decision making.</w:t>
       </w:r>
     </w:p>
     <w:p>
       <w:pPr>
         <w:tabs>
-          <w:tab w:pos="9878" w:val="right"/>
+          <w:tab w:pos="9432" w:val="right"/>
         </w:tabs>
-        <w:spacing w:before="56" w:after="1"/>
+        <w:spacing w:before="100" w:after="0"/>
       </w:pPr>
       <w:r>
         <w:rPr>
-          <w:rFonts w:ascii="Arial" w:hAnsi="Arial" w:eastAsia="Arial"/>
+          <w:rFonts w:ascii="Times New Roman" w:hAnsi="Times New Roman" w:eastAsia="Times New Roman"/>
           <w:b/>
-          <w:sz w:val="19"/>
+          <w:sz w:val="21"/>
         </w:rPr>
-        <w:t>Independent Contractor — Marketing Automation, Digital Marketing &amp; Web Development</w:t>
+        <w:t>Full-Time Missionary</w:t>
       </w:r>
       <w:r>
         <w:rPr>
-          <w:rFonts w:ascii="Arial" w:hAnsi="Arial" w:eastAsia="Arial"/>
+          <w:rFonts w:ascii="Times New Roman" w:hAnsi="Times New Roman" w:eastAsia="Times New Roman"/>
           <w:b/>
-          <w:color w:val="4E4E4E"/>
-          <w:sz w:val="17"/>
+          <w:sz w:val="21"/>
         </w:rPr>
         <w:tab/>
-        <w:t>2023 – Present</w:t>
+        <w:t>Philippines</w:t>
       </w:r>
     </w:p>
     <w:p>
       <w:pPr>
-        <w:spacing w:after="11"/>
+        <w:tabs>
+          <w:tab w:pos="9432" w:val="right"/>
+        </w:tabs>
+        <w:spacing w:after="30"/>
       </w:pPr>
       <w:r>
         <w:rPr>
-          <w:rFonts w:ascii="Arial" w:hAnsi="Arial" w:eastAsia="Arial"/>
+          <w:rFonts w:ascii="Times New Roman" w:hAnsi="Times New Roman" w:eastAsia="Times New Roman"/>
           <w:i/>
-          <w:color w:val="4E4E4E"/>
-          <w:sz w:val="17"/>
+          <w:sz w:val="21"/>
         </w:rPr>
-        <w:t>Self-Employed | Remote, Philippines</w:t>
+        <w:t>The Church of Jesus Christ of Latter-day Saints</w:t>
+      </w:r>
+      <w:r>
+        <w:rPr>
+          <w:rFonts w:ascii="Times New Roman" w:hAnsi="Times New Roman" w:eastAsia="Times New Roman"/>
+          <w:i/>
+          <w:sz w:val="21"/>
+        </w:rPr>
+        <w:tab/>
+        <w:t>August 2021 – August 2023</w:t>
       </w:r>
     </w:p>
     <w:p>
       <w:pPr>
         <w:keepLines/>
-        <w:spacing w:after="25"/>
-        <w:ind w:left="230" w:hanging="173"/>
+        <w:spacing w:after="24"/>
+        <w:ind w:left="317" w:hanging="245"/>
       </w:pPr>
       <w:r>
         <w:rPr>
-          <w:rFonts w:ascii="Arial" w:hAnsi="Arial" w:eastAsia="Arial"/>
-          <w:b/>
-          <w:color w:val="124F65"/>
+          <w:rFonts w:ascii="Times New Roman" w:hAnsi="Times New Roman" w:eastAsia="Times New Roman"/>
+          <w:sz w:val="21"/>
         </w:rPr>
-        <w:t xml:space="preserve">• </w:t>
+        <w:t>•</w:t>
       </w:r>
       <w:r>
         <w:rPr>
-          <w:rFonts w:ascii="Arial" w:hAnsi="Arial" w:eastAsia="Arial"/>
+          <w:rFonts w:ascii="Times New Roman" w:hAnsi="Times New Roman" w:eastAsia="Times New Roman"/>
+          <w:sz w:val="21"/>
         </w:rPr>
-        <w:t>Build and optimize lead-generation funnels, landing pages, and responsive web assets using GoHighLevel, Systeme.io, WordPress, HTML/CSS/JavaScript, Astro.js, and Tailwind CSS.</w:t>
+        <w:t xml:space="preserve">  Engaged 50+ individuals daily through outreach and teaching, developing strong interpersonal, customer service, and cross-cultural communication skills.</w:t>
       </w:r>
     </w:p>
     <w:p>
       <w:pPr>
         <w:keepLines/>
-        <w:spacing w:after="25"/>
-        <w:ind w:left="230" w:hanging="173"/>
+        <w:spacing w:after="24"/>
+        <w:ind w:left="317" w:hanging="245"/>
       </w:pPr>
       <w:r>
         <w:rPr>
-          <w:rFonts w:ascii="Arial" w:hAnsi="Arial" w:eastAsia="Arial"/>
-          <w:b/>
-          <w:color w:val="124F65"/>
+          <w:rFonts w:ascii="Times New Roman" w:hAnsi="Times New Roman" w:eastAsia="Times New Roman"/>
+          <w:sz w:val="21"/>
         </w:rPr>
-        <w:t xml:space="preserve">• </w:t>
+        <w:t>•</w:t>
       </w:r>
       <w:r>
         <w:rPr>
-          <w:rFonts w:ascii="Arial" w:hAnsi="Arial" w:eastAsia="Arial"/>
+          <w:rFonts w:ascii="Times New Roman" w:hAnsi="Times New Roman" w:eastAsia="Times New Roman"/>
+          <w:sz w:val="21"/>
         </w:rPr>
-        <w:t>Configure CRM forms, pipelines, lead-management processes, email/SMS nurture sequences, and automated follow-up workflows in GoHighLevel and Systeme.io.</w:t>
+        <w:t xml:space="preserve">  Trained and mentored 3 new volunteers on techniques and documentation, accelerating team contribution and performance.</w:t>
       </w:r>
     </w:p>
     <w:p>
       <w:pPr>
         <w:keepLines/>
-        <w:spacing w:after="25"/>
-        <w:ind w:left="230" w:hanging="173"/>
+        <w:spacing w:after="24"/>
+        <w:ind w:left="317" w:hanging="245"/>
       </w:pPr>
       <w:r>
         <w:rPr>
-          <w:rFonts w:ascii="Arial" w:hAnsi="Arial" w:eastAsia="Arial"/>
-          <w:b/>
-          <w:color w:val="124F65"/>
+          <w:rFonts w:ascii="Times New Roman" w:hAnsi="Times New Roman" w:eastAsia="Times New Roman"/>
+          <w:sz w:val="21"/>
         </w:rPr>
-        <w:t xml:space="preserve">• </w:t>
+        <w:t>•</w:t>
       </w:r>
       <w:r>
         <w:rPr>
-          <w:rFonts w:ascii="Arial" w:hAnsi="Arial" w:eastAsia="Arial"/>
+          <w:rFonts w:ascii="Times New Roman" w:hAnsi="Times New Roman" w:eastAsia="Times New Roman"/>
+          <w:sz w:val="21"/>
         </w:rPr>
-        <w:t>Plan and optimize Meta advertising campaigns, including ad creative, audience targeting, budget management, performance review, and lead-generation strategy for wellness offers.</w:t>
+        <w:t xml:space="preserve">  Maintained precise daily reports, contact records, and progress metrics for accountability and data-driven decisions.</w:t>
       </w:r>
     </w:p>
     <w:p>
       <w:pPr>
         <w:keepLines/>
-        <w:spacing w:after="25"/>
-        <w:ind w:left="230" w:hanging="173"/>
+        <w:spacing w:after="24"/>
+        <w:ind w:left="317" w:hanging="245"/>
       </w:pPr>
       <w:r>
         <w:rPr>
-          <w:rFonts w:ascii="Arial" w:hAnsi="Arial" w:eastAsia="Arial"/>
-          <w:b/>
-          <w:color w:val="124F65"/>
+          <w:rFonts w:ascii="Times New Roman" w:hAnsi="Times New Roman" w:eastAsia="Times New Roman"/>
+          <w:sz w:val="21"/>
         </w:rPr>
-        <w:t xml:space="preserve">• </w:t>
+        <w:t>•</w:t>
       </w:r>
       <w:r>
         <w:rPr>
-          <w:rFonts w:ascii="Arial" w:hAnsi="Arial" w:eastAsia="Arial"/>
+          <w:rFonts w:ascii="Times New Roman" w:hAnsi="Times New Roman" w:eastAsia="Times New Roman"/>
+          <w:sz w:val="21"/>
         </w:rPr>
-        <w:t>Create social media content, ad graphics, lead magnets, testimonial assets, before/after visuals, and conversion-focused copy aligned with campaign goals and funnel stages.</w:t>
+        <w:t xml:space="preserve">  Collaborated with 20+ person teams on scheduling and goal achievement in fast-paced environments; incorporated leader feedback to improve methods continuously.</w:t>
+      </w:r>
+    </w:p>
+    <w:p>
+      <w:pPr>
+        <w:keepNext/>
+        <w:spacing w:before="100" w:after="0"/>
+      </w:pPr>
+      <w:r>
+        <w:rPr>
+          <w:rFonts w:ascii="Times New Roman" w:hAnsi="Times New Roman" w:eastAsia="Times New Roman"/>
+          <w:b/>
+          <w:sz w:val="21"/>
+        </w:rPr>
+        <w:t>Budget Office Intern</w:t>
+      </w:r>
+    </w:p>
+    <w:p>
+      <w:pPr>
+        <w:keepNext/>
+        <w:spacing w:after="30"/>
+      </w:pPr>
+      <w:r>
+        <w:rPr>
+          <w:rFonts w:ascii="Times New Roman" w:hAnsi="Times New Roman" w:eastAsia="Times New Roman"/>
+          <w:i/>
+          <w:sz w:val="21"/>
+        </w:rPr>
+        <w:t>City Hall of Bato | Camarines Sur, Philippines | January 2019 – March 2019</w:t>
       </w:r>
     </w:p>
     <w:p>
       <w:pPr>
         <w:keepLines/>
-        <w:spacing w:after="25"/>
-        <w:ind w:left="230" w:hanging="173"/>
+        <w:spacing w:after="24"/>
+        <w:ind w:left="317" w:hanging="245"/>
       </w:pPr>
       <w:r>
         <w:rPr>
-          <w:rFonts w:ascii="Arial" w:hAnsi="Arial" w:eastAsia="Arial"/>
-          <w:b/>
-          <w:color w:val="124F65"/>
+          <w:rFonts w:ascii="Times New Roman" w:hAnsi="Times New Roman" w:eastAsia="Times New Roman"/>
+          <w:sz w:val="21"/>
         </w:rPr>
-        <w:t xml:space="preserve">• </w:t>
+        <w:t>•</w:t>
       </w:r>
       <w:r>
         <w:rPr>
-          <w:rFonts w:ascii="Arial" w:hAnsi="Arial" w:eastAsia="Arial"/>
+          <w:rFonts w:ascii="Times New Roman" w:hAnsi="Times New Roman" w:eastAsia="Times New Roman"/>
+          <w:sz w:val="21"/>
         </w:rPr>
-        <w:t>Support SEO, website content optimization, Google review initiatives, and funnel performance analysis to improve visibility, user experience, and marketing execution.</w:t>
+        <w:t xml:space="preserve">  Prepared and reviewed budget reports and financial documents for municipal departments, supporting accurate fiscal planning and transparency.</w:t>
       </w:r>
     </w:p>
     <w:p>
       <w:pPr>
         <w:keepLines/>
-        <w:spacing w:after="25"/>
-        <w:ind w:left="230" w:hanging="173"/>
+        <w:spacing w:after="24"/>
+        <w:ind w:left="317" w:hanging="245"/>
       </w:pPr>
       <w:r>
         <w:rPr>
-          <w:rFonts w:ascii="Arial" w:hAnsi="Arial" w:eastAsia="Arial"/>
-          <w:b/>
-          <w:color w:val="124F65"/>
+          <w:rFonts w:ascii="Times New Roman" w:hAnsi="Times New Roman" w:eastAsia="Times New Roman"/>
+          <w:sz w:val="21"/>
         </w:rPr>
-        <w:t xml:space="preserve">• </w:t>
+        <w:t>•</w:t>
       </w:r>
       <w:r>
         <w:rPr>
-          <w:rFonts w:ascii="Arial" w:hAnsi="Arial" w:eastAsia="Arial"/>
+          <w:rFonts w:ascii="Times New Roman" w:hAnsi="Times New Roman" w:eastAsia="Times New Roman"/>
+          <w:sz w:val="21"/>
         </w:rPr>
-        <w:t>Test forms, links, responsive layouts, funnels, and web deployments before release; troubleshoot issues, implement revisions, and deploy updates through Git/GitHub and Vercel.</w:t>
+        <w:t xml:space="preserve">  Drafted official correspondence and managed inter-office updates on budget allocations and procedures.</w:t>
       </w:r>
     </w:p>
     <w:p>
       <w:pPr>
         <w:keepLines/>
-        <w:spacing w:after="25"/>
-        <w:ind w:left="230" w:hanging="173"/>
+        <w:spacing w:after="24"/>
+        <w:ind w:left="317" w:hanging="245"/>
       </w:pPr>
       <w:r>
         <w:rPr>
-          <w:rFonts w:ascii="Arial" w:hAnsi="Arial" w:eastAsia="Arial"/>
-          <w:b/>
-          <w:color w:val="124F65"/>
+          <w:rFonts w:ascii="Times New Roman" w:hAnsi="Times New Roman" w:eastAsia="Times New Roman"/>
+          <w:sz w:val="21"/>
         </w:rPr>
-        <w:t xml:space="preserve">• </w:t>
+        <w:t>•</w:t>
       </w:r>
       <w:r>
         <w:rPr>
-          <w:rFonts w:ascii="Arial" w:hAnsi="Arial" w:eastAsia="Arial"/>
+          <w:rFonts w:ascii="Times New Roman" w:hAnsi="Times New Roman" w:eastAsia="Times New Roman"/>
+          <w:sz w:val="21"/>
         </w:rPr>
-        <w:t>Maintain organized project documentation, task tracking, campaign notes, and client updates using Trello and Google Workspace while working independently in a remote environment.</w:t>
+        <w:t xml:space="preserve">  Reorganized filing systems (physical/digital) to improve document retrieval speed and office efficiency; provided broad administrative support demonstrating reliability and multitasking.</w:t>
       </w:r>
     </w:p>
     <w:p>
       <w:pPr>
-        <w:spacing w:before="110" w:after="50"/>
+        <w:spacing w:before="180" w:after="160"/>
         <w:pBdr>
-          <w:bottom w:val="single" w:sz="5" w:space="2" w:color="9CB0B8"/>
+          <w:bottom w:val="single" w:sz="8" w:space="5" w:color="000000"/>
         </w:pBdr>
       </w:pPr>
       <w:r>
         <w:rPr>
-          <w:rFonts w:ascii="Arial" w:hAnsi="Arial" w:eastAsia="Arial"/>
+          <w:rFonts w:ascii="Times New Roman" w:hAnsi="Times New Roman" w:eastAsia="Times New Roman"/>
           <w:b/>
-          <w:color w:val="124F65"/>
-          <w:sz w:val="20"/>
+          <w:sz w:val="22"/>
         </w:rPr>
-        <w:t>CORE SKILLS</w:t>
+        <w:t>LEADERSHIP &amp; TEAM DEVELOPMENT</w:t>
       </w:r>
     </w:p>
     <w:p>
       <w:pPr>
-        <w:spacing w:after="26"/>
+        <w:keepNext/>
+        <w:spacing w:before="100" w:after="0"/>
       </w:pPr>
       <w:r>
         <w:rPr>
-          <w:rFonts w:ascii="Arial" w:hAnsi="Arial" w:eastAsia="Arial"/>
+          <w:rFonts w:ascii="Times New Roman" w:hAnsi="Times New Roman" w:eastAsia="Times New Roman"/>
           <w:b/>
+          <w:sz w:val="21"/>
         </w:rPr>
-        <w:t xml:space="preserve">Marketing Automation &amp; CRM: </w:t>
-      </w:r>
-      <w:r>
-        <w:rPr>
-          <w:rFonts w:ascii="Arial" w:hAnsi="Arial" w:eastAsia="Arial"/>
-        </w:rPr>
-        <w:t>GoHighLevel (GHL) • Systeme.io • ClickFunnels • CRM pipelines • Forms • Lead management • Email/SMS automation • Lead nurturing • Automated follow-ups • Funnel workflows • A/B testing</w:t>
+        <w:t>Missionary Leadership Progression</w:t>
       </w:r>
     </w:p>
     <w:p>
       <w:pPr>
-        <w:spacing w:after="26"/>
+        <w:spacing w:after="30"/>
       </w:pPr>
       <w:r>
         <w:rPr>
-          <w:rFonts w:ascii="Arial" w:hAnsi="Arial" w:eastAsia="Arial"/>
-          <w:b/>
+          <w:rFonts w:ascii="Times New Roman" w:hAnsi="Times New Roman" w:eastAsia="Times New Roman"/>
+          <w:i/>
+          <w:sz w:val="21"/>
         </w:rPr>
-        <w:t xml:space="preserve">Digital Marketing &amp; Content: </w:t>
-      </w:r>
-      <w:r>
-        <w:rPr>
-          <w:rFonts w:ascii="Arial" w:hAnsi="Arial" w:eastAsia="Arial"/>
-        </w:rPr>
-        <w:t>Meta Ads Manager • Paid lead generation • Social media management • Content strategy • Ad creative • Email marketing • SEO • Website content optimization • Lead magnets • Analytics/reporting • Canva</w:t>
-      </w:r>
-    </w:p>
-    <w:p>
-      <w:pPr>
-        <w:spacing w:after="26"/>
-      </w:pPr>
-      <w:r>
-        <w:rPr>
-          <w:rFonts w:ascii="Arial" w:hAnsi="Arial" w:eastAsia="Arial"/>
-          <w:b/>
-        </w:rPr>
-        <w:t xml:space="preserve">Web Development &amp; Technical: </w:t>
-      </w:r>
-      <w:r>
-        <w:rPr>
-          <w:rFonts w:ascii="Arial" w:hAnsi="Arial" w:eastAsia="Arial"/>
-        </w:rPr>
-        <w:t>HTML5 • CSS3 • Tailwind CSS • JavaScript (ES6+) • Astro.js • WordPress • Python • Node.js • MySQL • PostgreSQL • Git/GitHub • Vercel • Responsive design</w:t>
-      </w:r>
-    </w:p>
-    <w:p>
-      <w:pPr>
-        <w:spacing w:after="26"/>
-      </w:pPr>
-      <w:r>
-        <w:rPr>
-          <w:rFonts w:ascii="Arial" w:hAnsi="Arial" w:eastAsia="Arial"/>
-          <w:b/>
-        </w:rPr>
-        <w:t xml:space="preserve">AI, Operations &amp; Productivity: </w:t>
-      </w:r>
-      <w:r>
-        <w:rPr>
-          <w:rFonts w:ascii="Arial" w:hAnsi="Arial" w:eastAsia="Arial"/>
-        </w:rPr>
-        <w:t>AI-assisted research, content creation, and workflow planning • Google Workspace • Microsoft Office • Trello • Gorgias • Jotform • Google Forms • Technical documentation • PowerShell scripting</w:t>
-      </w:r>
-    </w:p>
-    <w:p>
-      <w:pPr>
-        <w:spacing w:before="110" w:after="50"/>
-        <w:pBdr>
-          <w:bottom w:val="single" w:sz="5" w:space="2" w:color="9CB0B8"/>
-        </w:pBdr>
-      </w:pPr>
-      <w:r>
-        <w:rPr>
-          <w:rFonts w:ascii="Arial" w:hAnsi="Arial" w:eastAsia="Arial"/>
-          <w:b/>
-          <w:color w:val="124F65"/>
-          <w:sz w:val="20"/>
-        </w:rPr>
-        <w:t>ADDITIONAL EXPERIENCE</w:t>
-      </w:r>
-    </w:p>
-    <w:p>
-      <w:pPr>
-        <w:tabs>
-          <w:tab w:pos="9878" w:val="right"/>
-        </w:tabs>
-        <w:spacing w:before="56" w:after="1"/>
-      </w:pPr>
-      <w:r>
-        <w:rPr>
-          <w:rFonts w:ascii="Arial" w:hAnsi="Arial" w:eastAsia="Arial"/>
-          <w:b/>
-          <w:sz w:val="19"/>
-        </w:rPr>
-        <w:t>Full-Time Missionary &amp; Team Leader</w:t>
-      </w:r>
-      <w:r>
-        <w:rPr>
-          <w:rFonts w:ascii="Arial" w:hAnsi="Arial" w:eastAsia="Arial"/>
-          <w:b/>
-          <w:color w:val="4E4E4E"/>
-          <w:sz w:val="17"/>
-        </w:rPr>
-        <w:tab/>
-        <w:t>Aug 2021 – Aug 2023</w:t>
-      </w:r>
-    </w:p>
-    <w:p>
-      <w:pPr>
-        <w:spacing w:after="11"/>
-      </w:pPr>
-      <w:r>
-        <w:rPr>
-          <w:rFonts w:ascii="Arial" w:hAnsi="Arial" w:eastAsia="Arial"/>
-          <w:i/>
-          <w:color w:val="4E4E4E"/>
-          <w:sz w:val="17"/>
-        </w:rPr>
-        <w:t>The Church of Jesus Christ of Latter-day Saints | Philippines</w:t>
+        <w:t>The Church of Jesus Christ of Latter-day Saints | Philippines | 2021 – 2023</w:t>
       </w:r>
     </w:p>
     <w:p>
       <w:pPr>
         <w:keepLines/>
-        <w:spacing w:after="25"/>
-        <w:ind w:left="230" w:hanging="173"/>
+        <w:spacing w:after="24"/>
+        <w:ind w:left="317" w:hanging="245"/>
       </w:pPr>
       <w:r>
         <w:rPr>
-          <w:rFonts w:ascii="Arial" w:hAnsi="Arial" w:eastAsia="Arial"/>
-          <w:b/>
-          <w:color w:val="124F65"/>
+          <w:rFonts w:ascii="Times New Roman" w:hAnsi="Times New Roman" w:eastAsia="Times New Roman"/>
+          <w:sz w:val="21"/>
         </w:rPr>
-        <w:t xml:space="preserve">• </w:t>
+        <w:t>•</w:t>
       </w:r>
       <w:r>
         <w:rPr>
-          <w:rFonts w:ascii="Arial" w:hAnsi="Arial" w:eastAsia="Arial"/>
+          <w:rFonts w:ascii="Times New Roman" w:hAnsi="Times New Roman" w:eastAsia="Times New Roman"/>
+          <w:sz w:val="21"/>
         </w:rPr>
-        <w:t>Progressed through increasingly responsible leadership assignments and ultimately led and trained teams of 10–30+ volunteers across multiple districts and zones.</w:t>
+        <w:t xml:space="preserve">  Progressed through leadership track: Junior Companion → District Leader Trainer → Senior Companion → District Leader → Zone Leader → Zone Leader Lead (2021–2023).</w:t>
       </w:r>
     </w:p>
     <w:p>
       <w:pPr>
         <w:keepLines/>
-        <w:spacing w:after="25"/>
-        <w:ind w:left="230" w:hanging="173"/>
+        <w:spacing w:after="24"/>
+        <w:ind w:left="317" w:hanging="245"/>
       </w:pPr>
       <w:r>
         <w:rPr>
-          <w:rFonts w:ascii="Arial" w:hAnsi="Arial" w:eastAsia="Arial"/>
-          <w:b/>
-          <w:color w:val="124F65"/>
+          <w:rFonts w:ascii="Times New Roman" w:hAnsi="Times New Roman" w:eastAsia="Times New Roman"/>
+          <w:sz w:val="21"/>
         </w:rPr>
-        <w:t xml:space="preserve">• </w:t>
+        <w:t>•</w:t>
       </w:r>
       <w:r>
         <w:rPr>
-          <w:rFonts w:ascii="Arial" w:hAnsi="Arial" w:eastAsia="Arial"/>
+          <w:rFonts w:ascii="Times New Roman" w:hAnsi="Times New Roman" w:eastAsia="Times New Roman"/>
+          <w:sz w:val="21"/>
         </w:rPr>
-        <w:t>Engaged with 50+ individuals daily through outreach and teaching, developing strong communication, customer-service, presentation, and cross-cultural relationship skills.</w:t>
+        <w:t xml:space="preserve">  Led and trained 10–30+ missionaries across districts/zones on teaching effectiveness, time management, and operations; delivered training, coaching, and evaluations to build team performance.</w:t>
       </w:r>
     </w:p>
     <w:p>
       <w:pPr>
         <w:keepLines/>
-        <w:spacing w:after="25"/>
-        <w:ind w:left="230" w:hanging="173"/>
+        <w:spacing w:after="24"/>
+        <w:ind w:left="317" w:hanging="245"/>
       </w:pPr>
       <w:r>
         <w:rPr>
-          <w:rFonts w:ascii="Arial" w:hAnsi="Arial" w:eastAsia="Arial"/>
-          <w:b/>
-          <w:color w:val="124F65"/>
+          <w:rFonts w:ascii="Times New Roman" w:hAnsi="Times New Roman" w:eastAsia="Times New Roman"/>
+          <w:sz w:val="21"/>
         </w:rPr>
-        <w:t xml:space="preserve">• </w:t>
+        <w:t>•</w:t>
       </w:r>
       <w:r>
         <w:rPr>
-          <w:rFonts w:ascii="Arial" w:hAnsi="Arial" w:eastAsia="Arial"/>
+          <w:rFonts w:ascii="Times New Roman" w:hAnsi="Times New Roman" w:eastAsia="Times New Roman"/>
+          <w:sz w:val="21"/>
         </w:rPr>
-        <w:t>Trained and mentored 3 new volunteers, coordinated schedules and goals, and provided coaching and performance feedback to support team consistency and accountability.</w:t>
+        <w:t xml:space="preserve">  Established goal-setting, scheduling, and reporting systems that improved accountability, transparency, and results in assigned areas</w:t>
       </w:r>
     </w:p>
     <w:p>
       <w:pPr>
-        <w:keepLines/>
-        <w:spacing w:after="25"/>
-        <w:ind w:left="230" w:hanging="173"/>
-      </w:pPr>
-      <w:r>
-        <w:rPr>
-          <w:rFonts w:ascii="Arial" w:hAnsi="Arial" w:eastAsia="Arial"/>
-          <w:b/>
-          <w:color w:val="124F65"/>
-        </w:rPr>
-        <w:t xml:space="preserve">• </w:t>
-      </w:r>
-      <w:r>
-        <w:rPr>
-          <w:rFonts w:ascii="Arial" w:hAnsi="Arial" w:eastAsia="Arial"/>
-        </w:rPr>
-        <w:t>Maintained accurate daily reports, contact records, progress metrics, and operational documentation while collaborating with teams of 20+ people.</w:t>
-      </w:r>
-    </w:p>
-    <w:p>
-      <w:pPr>
-        <w:tabs>
-          <w:tab w:pos="9878" w:val="right"/>
-        </w:tabs>
-        <w:spacing w:before="56" w:after="1"/>
-      </w:pPr>
-      <w:r>
-        <w:rPr>
-          <w:rFonts w:ascii="Arial" w:hAnsi="Arial" w:eastAsia="Arial"/>
-          <w:b/>
-          <w:sz w:val="19"/>
-        </w:rPr>
-        <w:t>Budget Office Intern</w:t>
-      </w:r>
-      <w:r>
-        <w:rPr>
-          <w:rFonts w:ascii="Arial" w:hAnsi="Arial" w:eastAsia="Arial"/>
-          <w:b/>
-          <w:color w:val="4E4E4E"/>
-          <w:sz w:val="17"/>
-        </w:rPr>
-        <w:tab/>
-        <w:t>Jan 2019 – Mar 2019</w:t>
-      </w:r>
-    </w:p>
-    <w:p>
-      <w:pPr>
-        <w:spacing w:after="11"/>
-      </w:pPr>
-      <w:r>
-        <w:rPr>
-          <w:rFonts w:ascii="Arial" w:hAnsi="Arial" w:eastAsia="Arial"/>
-          <w:i/>
-          <w:color w:val="4E4E4E"/>
-          <w:sz w:val="17"/>
-        </w:rPr>
-        <w:t>City Hall of Bato | Camarines Sur, Philippines</w:t>
-      </w:r>
-    </w:p>
-    <w:p>
-      <w:pPr>
-        <w:keepLines/>
-        <w:spacing w:after="25"/>
-        <w:ind w:left="230" w:hanging="173"/>
-      </w:pPr>
-      <w:r>
-        <w:rPr>
-          <w:rFonts w:ascii="Arial" w:hAnsi="Arial" w:eastAsia="Arial"/>
-          <w:b/>
-          <w:color w:val="124F65"/>
-        </w:rPr>
-        <w:t xml:space="preserve">• </w:t>
-      </w:r>
-      <w:r>
-        <w:rPr>
-          <w:rFonts w:ascii="Arial" w:hAnsi="Arial" w:eastAsia="Arial"/>
-        </w:rPr>
-        <w:t>Prepared and reviewed budget reports, financial documents, and official correspondence for municipal departments.</w:t>
-      </w:r>
-    </w:p>
-    <w:p>
-      <w:pPr>
-        <w:keepLines/>
-        <w:spacing w:after="25"/>
-        <w:ind w:left="230" w:hanging="173"/>
-      </w:pPr>
-      <w:r>
-        <w:rPr>
-          <w:rFonts w:ascii="Arial" w:hAnsi="Arial" w:eastAsia="Arial"/>
-          <w:b/>
-          <w:color w:val="124F65"/>
-        </w:rPr>
-        <w:t xml:space="preserve">• </w:t>
-      </w:r>
-      <w:r>
-        <w:rPr>
-          <w:rFonts w:ascii="Arial" w:hAnsi="Arial" w:eastAsia="Arial"/>
-        </w:rPr>
-        <w:t>Reorganized physical and digital filing systems to improve document retrieval and provided day-to-day administrative support.</w:t>
-      </w:r>
-    </w:p>
-    <w:p>
-      <w:pPr>
-        <w:spacing w:before="110" w:after="50"/>
+        <w:spacing w:before="180" w:after="160"/>
         <w:pBdr>
-          <w:bottom w:val="single" w:sz="5" w:space="2" w:color="9CB0B8"/>
+          <w:bottom w:val="single" w:sz="8" w:space="5" w:color="000000"/>
         </w:pBdr>
       </w:pPr>
       <w:r>
         <w:rPr>
-          <w:rFonts w:ascii="Arial" w:hAnsi="Arial" w:eastAsia="Arial"/>
+          <w:rFonts w:ascii="Times New Roman" w:hAnsi="Times New Roman" w:eastAsia="Times New Roman"/>
           <w:b/>
-          <w:color w:val="124F65"/>
-          <w:sz w:val="20"/>
+          <w:sz w:val="22"/>
         </w:rPr>
         <w:t>EDUCATION</w:t>
       </w:r>
     </w:p>
     <w:p>
       <w:pPr>
-        <w:tabs>
-          <w:tab w:pos="9878" w:val="right"/>
-        </w:tabs>
-        <w:spacing w:before="56" w:after="1"/>
+        <w:keepNext/>
+        <w:spacing w:before="100" w:after="0"/>
       </w:pPr>
       <w:r>
         <w:rPr>
-          <w:rFonts w:ascii="Arial" w:hAnsi="Arial" w:eastAsia="Arial"/>
+          <w:rFonts w:ascii="Times New Roman" w:hAnsi="Times New Roman" w:eastAsia="Times New Roman"/>
           <w:b/>
-          <w:sz w:val="19"/>
+          <w:sz w:val="21"/>
+        </w:rPr>
+        <w:t>Brigham Young University, Idaho</w:t>
+      </w:r>
+    </w:p>
+    <w:p>
+      <w:pPr>
+        <w:tabs>
+          <w:tab w:pos="9432" w:val="right"/>
+        </w:tabs>
+        <w:spacing w:after="30"/>
+      </w:pPr>
+      <w:r>
+        <w:rPr>
+          <w:rFonts w:ascii="Times New Roman" w:hAnsi="Times New Roman" w:eastAsia="Times New Roman"/>
+          <w:i/>
+          <w:sz w:val="21"/>
         </w:rPr>
         <w:t>Bachelor of Science in Software Development</w:t>
       </w:r>
       <w:r>
         <w:rPr>
-          <w:rFonts w:ascii="Arial" w:hAnsi="Arial" w:eastAsia="Arial"/>
-          <w:b/>
-          <w:color w:val="4E4E4E"/>
-          <w:sz w:val="17"/>
+          <w:rFonts w:ascii="Times New Roman" w:hAnsi="Times New Roman" w:eastAsia="Times New Roman"/>
+          <w:i/>
+          <w:sz w:val="21"/>
         </w:rPr>
         <w:tab/>
-        <w:t>In Progress</w:t>
+        <w:t>Graduated</w:t>
       </w:r>
     </w:p>
     <w:p>
       <w:pPr>
-        <w:spacing w:after="11"/>
+        <w:keepNext/>
+        <w:spacing w:before="100" w:after="0"/>
       </w:pPr>
       <w:r>
         <w:rPr>
-          <w:rFonts w:ascii="Arial" w:hAnsi="Arial" w:eastAsia="Arial"/>
-          <w:i/>
-          <w:color w:val="4E4E4E"/>
-          <w:sz w:val="17"/>
+          <w:rFonts w:ascii="Times New Roman" w:hAnsi="Times New Roman" w:eastAsia="Times New Roman"/>
+          <w:b/>
+          <w:sz w:val="21"/>
         </w:rPr>
-        <w:t>Brigham Young University–Idaho via BYU-Pathway Worldwide | Online</w:t>
+        <w:t>Brigham Young University, Idaho</w:t>
       </w:r>
     </w:p>
     <w:p>
       <w:pPr>
-        <w:spacing w:after="24"/>
-        <w:ind w:left="230"/>
+        <w:tabs>
+          <w:tab w:pos="9432" w:val="right"/>
+        </w:tabs>
+        <w:spacing w:after="30"/>
       </w:pPr>
       <w:r>
         <w:rPr>
-          <w:rFonts w:ascii="Arial" w:hAnsi="Arial" w:eastAsia="Arial"/>
+          <w:rFonts w:ascii="Times New Roman" w:hAnsi="Times New Roman" w:eastAsia="Times New Roman"/>
+          <w:i/>
+          <w:sz w:val="21"/>
         </w:rPr>
-        <w:t>Certificates: Web &amp; Computer Programming • Web Development • Software Development • BYU-Pathway Connect</w:t>
+        <w:t>Associate of Applied Science in Software Development</w:t>
+      </w:r>
+      <w:r>
+        <w:rPr>
+          <w:rFonts w:ascii="Times New Roman" w:hAnsi="Times New Roman" w:eastAsia="Times New Roman"/>
+          <w:i/>
+          <w:sz w:val="21"/>
+        </w:rPr>
+        <w:tab/>
+        <w:t>Graduated</w:t>
+      </w:r>
+    </w:p>
+    <w:p>
+      <w:pPr>
+        <w:keepNext/>
+        <w:spacing w:before="80" w:after="20"/>
+      </w:pPr>
+      <w:r>
+        <w:rPr>
+          <w:rFonts w:ascii="Times New Roman" w:hAnsi="Times New Roman" w:eastAsia="Times New Roman"/>
+          <w:b/>
+          <w:sz w:val="21"/>
+        </w:rPr>
+        <w:t>Certificates</w:t>
+      </w:r>
+    </w:p>
+    <w:p>
+      <w:pPr>
+        <w:keepLines/>
+        <w:spacing w:after="24"/>
+        <w:ind w:left="317" w:hanging="245"/>
+      </w:pPr>
+      <w:r>
+        <w:rPr>
+          <w:rFonts w:ascii="Times New Roman" w:hAnsi="Times New Roman" w:eastAsia="Times New Roman"/>
+          <w:sz w:val="21"/>
+        </w:rPr>
+        <w:t>•</w:t>
+      </w:r>
+      <w:r>
+        <w:rPr>
+          <w:rFonts w:ascii="Times New Roman" w:hAnsi="Times New Roman" w:eastAsia="Times New Roman"/>
+          <w:sz w:val="21"/>
+        </w:rPr>
+        <w:t xml:space="preserve">  Web &amp; Computer Programming</w:t>
+      </w:r>
+    </w:p>
+    <w:p>
+      <w:pPr>
+        <w:keepLines/>
+        <w:spacing w:after="24"/>
+        <w:ind w:left="317" w:hanging="245"/>
+      </w:pPr>
+      <w:r>
+        <w:rPr>
+          <w:rFonts w:ascii="Times New Roman" w:hAnsi="Times New Roman" w:eastAsia="Times New Roman"/>
+          <w:sz w:val="21"/>
+        </w:rPr>
+        <w:t>•</w:t>
+      </w:r>
+      <w:r>
+        <w:rPr>
+          <w:rFonts w:ascii="Times New Roman" w:hAnsi="Times New Roman" w:eastAsia="Times New Roman"/>
+          <w:sz w:val="21"/>
+        </w:rPr>
+        <w:t xml:space="preserve">  Web Development</w:t>
+      </w:r>
+    </w:p>
+    <w:p>
+      <w:pPr>
+        <w:keepLines/>
+        <w:spacing w:after="24"/>
+        <w:ind w:left="317" w:hanging="245"/>
+      </w:pPr>
+      <w:r>
+        <w:rPr>
+          <w:rFonts w:ascii="Times New Roman" w:hAnsi="Times New Roman" w:eastAsia="Times New Roman"/>
+          <w:sz w:val="21"/>
+        </w:rPr>
+        <w:t>•</w:t>
+      </w:r>
+      <w:r>
+        <w:rPr>
+          <w:rFonts w:ascii="Times New Roman" w:hAnsi="Times New Roman" w:eastAsia="Times New Roman"/>
+          <w:sz w:val="21"/>
+        </w:rPr>
+        <w:t xml:space="preserve">  Software Development</w:t>
+      </w:r>
+    </w:p>
+    <w:p>
+      <w:pPr>
+        <w:keepLines/>
+        <w:spacing w:after="24"/>
+        <w:ind w:left="317" w:hanging="245"/>
+      </w:pPr>
+      <w:r>
+        <w:rPr>
+          <w:rFonts w:ascii="Times New Roman" w:hAnsi="Times New Roman" w:eastAsia="Times New Roman"/>
+          <w:sz w:val="21"/>
+        </w:rPr>
+        <w:t>•</w:t>
+      </w:r>
+      <w:r>
+        <w:rPr>
+          <w:rFonts w:ascii="Times New Roman" w:hAnsi="Times New Roman" w:eastAsia="Times New Roman"/>
+          <w:sz w:val="21"/>
+        </w:rPr>
+        <w:t xml:space="preserve">  BYU-Pathway Connect Certificate</w:t>
+      </w:r>
+    </w:p>
+    <w:p>
+      <w:pPr>
+        <w:keepNext/>
+        <w:spacing w:before="100" w:after="0"/>
+      </w:pPr>
+      <w:r>
+        <w:rPr>
+          <w:rFonts w:ascii="Times New Roman" w:hAnsi="Times New Roman" w:eastAsia="Times New Roman"/>
+          <w:b/>
+          <w:sz w:val="21"/>
+        </w:rPr>
+        <w:t>Nabua National High School</w:t>
+      </w:r>
+    </w:p>
+    <w:p>
+      <w:pPr>
+        <w:tabs>
+          <w:tab w:pos="9432" w:val="right"/>
+        </w:tabs>
+        <w:spacing w:after="30"/>
+      </w:pPr>
+      <w:r>
+        <w:rPr>
+          <w:rFonts w:ascii="Times New Roman" w:hAnsi="Times New Roman" w:eastAsia="Times New Roman"/>
+          <w:i/>
+          <w:sz w:val="21"/>
+        </w:rPr>
+        <w:t>Humanities and Social Sciences (HUMSS)</w:t>
+      </w:r>
+      <w:r>
+        <w:rPr>
+          <w:rFonts w:ascii="Times New Roman" w:hAnsi="Times New Roman" w:eastAsia="Times New Roman"/>
+          <w:i/>
+          <w:sz w:val="21"/>
+        </w:rPr>
+        <w:tab/>
+        <w:t>Camarines Sur, Philippines</w:t>
+      </w:r>
+    </w:p>
+    <w:p>
+      <w:pPr>
+        <w:spacing w:before="180" w:after="160"/>
+        <w:pBdr>
+          <w:bottom w:val="single" w:sz="8" w:space="5" w:color="000000"/>
+        </w:pBdr>
+      </w:pPr>
+      <w:r>
+        <w:rPr>
+          <w:rFonts w:ascii="Times New Roman" w:hAnsi="Times New Roman" w:eastAsia="Times New Roman"/>
+          <w:b/>
+          <w:sz w:val="22"/>
+        </w:rPr>
+        <w:t>ADDITIONAL INFORMATION</w:t>
+      </w:r>
+    </w:p>
+    <w:p>
+      <w:pPr>
+        <w:spacing w:after="0"/>
+      </w:pPr>
+      <w:r>
+        <w:rPr>
+          <w:rFonts w:ascii="Times New Roman" w:hAnsi="Times New Roman" w:eastAsia="Times New Roman"/>
+          <w:sz w:val="21"/>
+        </w:rPr>
+        <w:t>Availability: Open to full-time, part-time, contract or freelance roles in Web Development, Digital Marketing, Funnel Building, or Administrative Support (remote or on-site). Interests: Emerging web tech &amp; AI tools, basketball, home fitness, music, community service (LDS returned missionary). Portfolio &amp; samples available on request or via personal site.</w:t>
       </w:r>
     </w:p>
     <w:sectPr>
-      <w:footerReference w:type="default" r:id="rId11"/>
       <w:pgSz w:w="12240" w:h="15840"/>
-      <w:pgMar w:top="691" w:right="893" w:bottom="691" w:left="893" w:header="259" w:footer="288" w:gutter="0"/>
+      <w:pgMar w:top="1037" w:right="1224" w:bottom="936" w:left="1224" w:header="360" w:footer="360" w:gutter="0"/>
       <w:cols w:space="720"/>
       <w:docGrid w:linePitch="360"/>
     </w:sectPr>
   </w:body>
 </w:document>
-</file>
-
-<file path=word/footer1.xml><?xml version="1.0" encoding="utf-8"?>
-<w:ftr xmlns:m="http://schemas.openxmlformats.org/officeDocument/2006/math" xmlns:mc="http://schemas.openxmlformats.org/markup-compatibility/2006" xmlns:mo="http://schemas.microsoft.com/office/mac/office/2008/main" xmlns:mv="urn:schemas-microsoft-com:mac:vml" xmlns:o="urn:schemas-microsoft-com:office:office" xmlns:r="http://schemas.openxmlformats.org/officeDocument/2006/relationships" xmlns:v="urn:schemas-microsoft-com:vml" xmlns:w10="urn:schemas-microsoft-com:office:word" xmlns:w14="http://schemas.microsoft.com/office/word/2010/wordml" xmlns:w="http://schemas.openxmlformats.org/wordprocessingml/2006/main" xmlns:wne="http://schemas.microsoft.com/office/word/2006/wordml" xmlns:wp14="http://schemas.microsoft.com/office/word/2010/wordprocessingDrawing" xmlns:wp="http://schemas.openxmlformats.org/drawingml/2006/wordprocessingDrawing" xmlns:wpc="http://schemas.microsoft.com/office/word/2010/wordprocessingCanvas" xmlns:wpg="http://schemas.microsoft.com/office/word/2010/wordprocessingGroup" xmlns:wpi="http://schemas.microsoft.com/office/word/2010/wordprocessingInk" xmlns:wps="http://schemas.microsoft.com/office/word/2010/wordprocessingShape" mc:Ignorable="w14 wp14">
-  <w:p>
-    <w:pPr>
-      <w:pStyle w:val="Footer"/>
-      <w:jc w:val="center"/>
-    </w:pPr>
-    <w:r>
-      <w:rPr>
-        <w:rFonts w:ascii="Arial" w:hAnsi="Arial" w:eastAsia="Arial"/>
-        <w:color w:val="919191"/>
-        <w:sz w:val="14"/>
-      </w:rPr>
-      <w:t>Mar Thayne Lowell Nacionales</w:t>
-    </w:r>
-  </w:p>
-</w:ftr>
 </file>
 
 <file path=word/numbering.xml><?xml version="1.0" encoding="utf-8"?>
@@ -1056,12 +1399,11 @@
     <w:qFormat/>
     <w:rsid w:val="00FC693F"/>
     <w:pPr>
-      <w:spacing w:after="29" w:line="240" w:lineRule="auto"/>
+      <w:spacing w:after="0" w:line="240" w:lineRule="auto"/>
     </w:pPr>
     <w:rPr>
-      <w:rFonts w:ascii="Arial" w:hAnsi="Arial"/>
-      <w:color w:val="1C1C1C"/>
-      <w:sz w:val="18"/>
+      <w:rFonts w:ascii="Times New Roman" w:hAnsi="Times New Roman"/>
+      <w:sz w:val="21"/>
     </w:rPr>
   </w:style>
   <w:style w:type="paragraph" w:styleId="Header">

</xml_diff>